<commit_message>
fix(templates): the fire-safety review pass: decision 3's legal basis upright, decision 6's art. 3 reworded, the posted instructions and sheet give the address a line of its own and a dash for what is unset, the IPSU drops the chemical-foam and turned-over extinguishers OMAI 135/2023 art. 20 bans (#391) and the annual test its foam question, ten left, and a test keeps a question's answers with it
</commit_message>
<xml_diff>
--- a/packages/document-engine/templates/fire/1.7_fire_decision_instructions.docx
+++ b/packages/document-engine/templates/fire/1.7_fire_decision_instructions.docx
@@ -2944,7 +2944,38 @@
           <w:szCs w:val="20"/>
           <w:lang w:val="ro-RO"/>
         </w:rPr>
-        <w:t>Locul de muncă: {{name}}, {{activity}}, {{address}}</w:t>
+        <w:t>Locul de muncă: {{name}}, {{activity}}</w:t>
+      </w:r>
+    </w:p>
+    <w:p>
+      <w:pPr>
+        <w:pStyle w:val="Normal"/>
+        <w:keepNext w:val="false"/>
+        <w:pageBreakBefore w:val="false"/>
+        <w:widowControl/>
+        <w:numPr>
+          <w:ilvl w:val="0"/>
+          <w:numId w:val="0"/>
+        </w:numPr>
+        <w:spacing w:before="0" w:after="240"/>
+        <w:ind w:hanging="0" w:left="0"/>
+        <w:jc w:val="center"/>
+        <w:rPr/>
+      </w:pPr>
+      <w:r>
+        <w:rPr>
+          <w:rStyle w:val="text1"/>
+          <w:rFonts w:eastAsia="Arial" w:cs="Arial" w:ascii="Arial" w:hAnsi="Arial"/>
+          <w:b w:val="false"/>
+          <w:i w:val="false"/>
+          <w:color w:val="auto"/>
+          <w:spacing w:val="0"/>
+          <w:w w:val="100"/>
+          <w:sz w:val="20"/>
+          <w:szCs w:val="20"/>
+          <w:lang w:val="ro-RO"/>
+        </w:rPr>
+        <w:t>Adresa: {{address}}</w:t>
       </w:r>
     </w:p>
     <w:p>

</xml_diff>